<commit_message>
docs: limit zero-crossing claims to the KVM ordinary runs
Section 7.1 now says only the E02 and N01 exploratory intervals cross zero. The Ryzen intervals do not, and they are still not a frequency lock, constant-time proof, or sign-off.
</commit_message>
<xml_diff>
--- a/deliverables/submission/CACR2026EA16XZ/rewrite-20261008/CACR2026EA16XZ-作品设计报告-重写版.docx
+++ b/deliverables/submission/CACR2026EA16XZ/rewrite-20261008/CACR2026EA16XZ-作品设计报告-重写版.docx
@@ -1927,7 +1927,7 @@
       </w:hyperlink>
       <w:r>
         <w:tab/>
-        <w:t>33</w:t>
+        <w:t>34</w:t>
       </w:r>
     </w:p>
     <w:p>
@@ -1946,7 +1946,7 @@
       </w:hyperlink>
       <w:r>
         <w:tab/>
-        <w:t>34</w:t>
+        <w:t>35</w:t>
       </w:r>
     </w:p>
     <w:p>
@@ -1965,7 +1965,7 @@
       </w:hyperlink>
       <w:r>
         <w:tab/>
-        <w:t>36</w:t>
+        <w:t>37</w:t>
       </w:r>
     </w:p>
     <w:p>
@@ -23035,7 +23035,7 @@
           <w:rFonts w:hint="eastAsia" w:ascii="Times New Roman" w:hAnsi="Times New Roman" w:eastAsia="SimSun"/>
           <w:sz w:val="24"/>
         </w:rPr>
-        <w:t xml:space="preserve">普通记录揭示了有限运行中的性能波动，其探索区间均跨零；八个固定精确复算任务与</w:t>
+        <w:t xml:space="preserve">普通记录揭示了有限运行中的性能波动。KVM 上 E02 与 N01 的探索区间均跨零。Ryzen 裸金属的探索区间不跨零，这些记录仍不是频率锁定、恒时证明或竞赛签收。八个固定精确复算任务与</w:t>
       </w:r>
       <w:r>
         <w:rPr>

</xml_diff>